<commit_message>
JPML motion brief: fb render builds the docx (render.sh, build-reference.sh and pages.awk deleted): docx/reference.xml (the court styles and the two footers on pandoc's reference), jpml.lua writes its document-order needles (the body's first block as page 1) and the last section to fb render; byte-identical .docx.pdf with the old face, then the typst face ({font}, Times New Roman) for EB Garamond; 12 pages as before; check.sh typst and docx 0 failed (fb-595.68.4)
</commit_message>
<xml_diff>
--- a/courts/national/judicial-panel-on-multidistrict-litigation/motion-brief/usage/OUTPUT-motion-brief.docx
+++ b/courts/national/judicial-panel-on-multidistrict-litigation/motion-brief/usage/OUTPUT-motion-brief.docx
@@ -1326,7 +1326,7 @@
         <w:tab/>
       </w:r>
       <w:r>
-        <w:t xml:space="preserve">5</w:t>
+        <w:t xml:space="preserve">6</w:t>
       </w:r>
     </w:p>
     <w:p>
@@ -2809,6 +2809,72 @@
 </w:footnotes>
 </file>
 
+<file path=word/ftr-add.xml><?xml version="1.0" encoding="utf-8"?>
+<w:ftr xmlns:w="http://schemas.openxmlformats.org/wordprocessingml/2006/main" xmlns:r="http://schemas.openxmlformats.org/officeDocument/2006/relationships">
+  <w:p>
+    <w:pPr>
+      <w:spacing w:before="0" w:after="0"/>
+      <w:jc w:val="center"/>
+    </w:pPr>
+    <w:r>
+      <w:t>Add-</w:t>
+    </w:r>
+    <w:r>
+      <w:fldChar w:fldCharType="begin"/>
+    </w:r>
+    <w:r>
+      <w:instrText xml:space="preserve"> PAGE </w:instrText>
+    </w:r>
+    <w:r>
+      <w:fldChar w:fldCharType="separate"/>
+    </w:r>
+    <w:r>
+      <w:t>1</w:t>
+    </w:r>
+    <w:r>
+      <w:fldChar w:fldCharType="end"/>
+    </w:r>
+  </w:p>
+</w:ftr>
+</file>
+
+<file path=word/ftr-none.xml><?xml version="1.0" encoding="utf-8"?>
+<w:ftr xmlns:w="http://schemas.openxmlformats.org/wordprocessingml/2006/main" xmlns:r="http://schemas.openxmlformats.org/officeDocument/2006/relationships">
+  <w:p>
+    <w:pPr>
+      <w:spacing w:before="0" w:after="0"/>
+      <w:jc w:val="center"/>
+    </w:pPr>
+  </w:p>
+</w:ftr>
+</file>
+
+<file path=word/ftr-page.xml><?xml version="1.0" encoding="utf-8"?>
+<w:ftr xmlns:w="http://schemas.openxmlformats.org/wordprocessingml/2006/main" xmlns:r="http://schemas.openxmlformats.org/officeDocument/2006/relationships">
+  <w:p>
+    <w:pPr>
+      <w:spacing w:before="0" w:after="0"/>
+      <w:jc w:val="center"/>
+    </w:pPr>
+    <w:r>
+      <w:fldChar w:fldCharType="begin"/>
+    </w:r>
+    <w:r>
+      <w:instrText xml:space="preserve"> PAGE </w:instrText>
+    </w:r>
+    <w:r>
+      <w:fldChar w:fldCharType="separate"/>
+    </w:r>
+    <w:r>
+      <w:t>1</w:t>
+    </w:r>
+    <w:r>
+      <w:fldChar w:fldCharType="end"/>
+    </w:r>
+  </w:p>
+</w:ftr>
+</file>
+
 <file path=word/numbering.xml><?xml version="1.0" encoding="utf-8"?>
 <w:numbering xmlns:w="http://schemas.openxmlformats.org/wordprocessingml/2006/main">
   <w:abstractNum w:abstractNumId="990">
@@ -3013,7 +3079,7 @@
   <w:docDefaults>
     <w:rPrDefault>
       <w:rPr>
-        <w:rFonts w:ascii="EB Garamond" w:hAnsi="EB Garamond" w:eastAsia="EB Garamond" w:cs="EB Garamond"/>
+        <w:rFonts w:ascii="Times New Roman" w:hAnsi="Times New Roman" w:eastAsia="Times New Roman" w:cs="Times New Roman"/>
         <w:sz w:val="24"/>
         <w:szCs w:val="24"/>
         <w:lang w:val="en-US" w:eastAsia="en-US" w:bidi="ar-SA"/>
@@ -3026,6 +3092,44 @@
     </w:pPrDefault>
   </w:docDefaults>
   <w:latentStyles w:defLockedState="0" w:defUIPriority="0" w:defSemiHidden="0" w:defUnhideWhenUsed="0" w:defQFormat="0" w:count="276"/>
+  <w:style w:type="paragraph" w:default="1" w:styleId="Normal">
+    <w:name w:val="Normal"/>
+    <w:qFormat/>
+    <w:pPr>
+      <w:widowControl/>
+      <w:spacing w:before="0" w:after="0" w:line="240" w:lineRule="auto"/>
+      <w:ind w:firstLine="0"/>
+      <w:jc w:val="left"/>
+    </w:pPr>
+  </w:style>
+  <w:style w:type="paragraph" w:styleId="BodyText">
+    <w:name w:val="Body Text"/>
+    <w:basedOn w:val="Normal"/>
+    <w:qFormat/>
+    <w:pPr>
+      <w:spacing w:before="0" w:after="0" w:line="480" w:lineRule="exact"/>
+      <w:ind w:firstLine="720"/>
+    </w:pPr>
+  </w:style>
+  <w:style w:type="paragraph" w:styleId="FirstParagraph">
+    <w:name w:val="First Paragraph"/>
+    <w:basedOn w:val="BodyText"/>
+    <w:next w:val="BodyText"/>
+    <w:qFormat/>
+    <w:pPr>
+      <w:spacing w:before="0" w:after="0" w:line="480" w:lineRule="exact"/>
+      <w:ind w:firstLine="720"/>
+    </w:pPr>
+  </w:style>
+  <w:style w:type="paragraph" w:styleId="Compact">
+    <w:name w:val="Compact"/>
+    <w:basedOn w:val="BodyText"/>
+    <w:qFormat/>
+    <w:pPr>
+      <w:spacing w:before="0" w:after="0" w:line="480" w:lineRule="exact"/>
+      <w:ind w:firstLine="0"/>
+    </w:pPr>
+  </w:style>
   <w:style w:type="paragraph" w:styleId="Title">
     <w:name w:val="Title"/>
     <w:basedOn w:val="Normal"/>
@@ -3488,6 +3592,18 @@
       <w:spacing w:before="100" w:after="100"/>
       <w:ind w:firstLine="0" w:left="480" w:right="480"/>
     </w:pPr>
+  </w:style>
+  <w:style w:type="paragraph" w:styleId="FootnoteText">
+    <w:name w:val="footnote text"/>
+    <w:basedOn w:val="Normal"/>
+    <w:pPr>
+      <w:spacing w:before="0" w:after="80" w:line="240" w:lineRule="auto"/>
+      <w:ind w:firstLine="0"/>
+    </w:pPr>
+    <w:rPr>
+      <w:sz w:val="24"/>
+      <w:szCs w:val="24"/>
+    </w:rPr>
   </w:style>
   <w:style w:type="paragraph" w:styleId="FootnoteBlockText">
     <w:name w:val="Footnote Block Text"/>
@@ -3625,56 +3741,6 @@
       <w:b w:val="0"/>
       <w:bCs w:val="0"/>
       <w:color w:val="365F91" w:themeColor="accent1" w:themeShade="BF"/>
-    </w:rPr>
-  </w:style>
-  <w:style w:type="paragraph" w:default="1" w:styleId="Normal">
-    <w:name w:val="Normal"/>
-    <w:qFormat/>
-    <w:pPr>
-      <w:widowControl/>
-      <w:spacing w:before="0" w:after="0" w:line="240" w:lineRule="auto"/>
-      <w:ind w:firstLine="0"/>
-      <w:jc w:val="left"/>
-    </w:pPr>
-  </w:style>
-  <w:style w:type="paragraph" w:styleId="BodyText">
-    <w:name w:val="Body Text"/>
-    <w:basedOn w:val="Normal"/>
-    <w:qFormat/>
-    <w:pPr>
-      <w:spacing w:before="0" w:after="0" w:line="480" w:lineRule="exact"/>
-      <w:ind w:firstLine="720"/>
-    </w:pPr>
-  </w:style>
-  <w:style w:type="paragraph" w:styleId="FirstParagraph">
-    <w:name w:val="First Paragraph"/>
-    <w:basedOn w:val="BodyText"/>
-    <w:next w:val="BodyText"/>
-    <w:qFormat/>
-    <w:pPr>
-      <w:spacing w:before="0" w:after="0" w:line="480" w:lineRule="exact"/>
-      <w:ind w:firstLine="720"/>
-    </w:pPr>
-  </w:style>
-  <w:style w:type="paragraph" w:styleId="Compact">
-    <w:name w:val="Compact"/>
-    <w:basedOn w:val="BodyText"/>
-    <w:qFormat/>
-    <w:pPr>
-      <w:spacing w:before="0" w:after="0" w:line="480" w:lineRule="exact"/>
-      <w:ind w:firstLine="0"/>
-    </w:pPr>
-  </w:style>
-  <w:style w:type="paragraph" w:styleId="FootnoteText">
-    <w:name w:val="footnote text"/>
-    <w:basedOn w:val="Normal"/>
-    <w:pPr>
-      <w:spacing w:before="0" w:after="80" w:line="240" w:lineRule="auto"/>
-      <w:ind w:firstLine="0"/>
-    </w:pPr>
-    <w:rPr>
-      <w:sz w:val="24"/>
-      <w:szCs w:val="24"/>
     </w:rPr>
   </w:style>
   <w:style w:type="paragraph" w:customStyle="1" w:styleId="JPMLHeading2">

</xml_diff>